<commit_message>
docs: DatabaseGateway a Analyzing pro zakaznika jako Technicky popis
Zakaznik obsluhuje jen ScadaViewer a HMI (Navod k pouziti); sluzby na pozadi maji Technicky popis
(popisna forma) + Technicky manual. Odkazy ve vsech dokumentech, publish.py, README.

Co-Authored-By: Claude Opus 5.5 <noreply@anthropic.com>
</commit_message>
<xml_diff>
--- a/04_docs/manual/ScadaViewer_Technical_Manual_v2.6.10_2026-10-28_EN.docx
+++ b/04_docs/manual/ScadaViewer_Technical_Manual_v2.6.10_2026-10-28_EN.docx
@@ -393,7 +393,7 @@
           <w:szCs w:val="20"/>
         </w:rPr>
         <w:alias w:val="Contents"/>
-        <w:id w:val="-54236667"/>
+        <w:id w:val="-1968192893"/>
       </w:sdtPr>
       <w:sdtEndPr/>
       <w:sdtContent>
@@ -422,7 +422,7 @@
           <w:r>
             <w:fldChar w:fldCharType="separate"/>
           </w:r>
-          <w:hyperlink w:anchor="_Toc244090132" w:history="1">
+          <w:hyperlink w:anchor="_Toc244093633" w:history="1">
             <w:r>
               <w:rPr>
                 <w:rStyle w:val="Hypertextovodkaz"/>
@@ -446,7 +446,7 @@
               <w:rPr>
                 <w:noProof/>
               </w:rPr>
-              <w:instrText xml:space="preserve"> PAGEREF _Toc244090132 \h </w:instrText>
+              <w:instrText xml:space="preserve"> PAGEREF _Toc244093633 \h </w:instrText>
             </w:r>
             <w:r>
               <w:rPr>
@@ -489,7 +489,7 @@
               <w14:ligatures w14:val="standardContextual"/>
             </w:rPr>
           </w:pPr>
-          <w:hyperlink w:anchor="_Toc244090133" w:history="1">
+          <w:hyperlink w:anchor="_Toc244093634" w:history="1">
             <w:r>
               <w:rPr>
                 <w:rStyle w:val="Hypertextovodkaz"/>
@@ -513,7 +513,7 @@
               <w:rPr>
                 <w:noProof/>
               </w:rPr>
-              <w:instrText xml:space="preserve"> PAGEREF _Toc244090133 \h </w:instrText>
+              <w:instrText xml:space="preserve"> PAGEREF _Toc244093634 \h </w:instrText>
             </w:r>
             <w:r>
               <w:rPr>
@@ -556,7 +556,7 @@
               <w14:ligatures w14:val="standardContextual"/>
             </w:rPr>
           </w:pPr>
-          <w:hyperlink w:anchor="_Toc244090134" w:history="1">
+          <w:hyperlink w:anchor="_Toc244093635" w:history="1">
             <w:r>
               <w:rPr>
                 <w:rStyle w:val="Hypertextovodkaz"/>
@@ -580,7 +580,7 @@
               <w:rPr>
                 <w:noProof/>
               </w:rPr>
-              <w:instrText xml:space="preserve"> PAGEREF _Toc244090134 \h </w:instrText>
+              <w:instrText xml:space="preserve"> PAGEREF _Toc244093635 \h </w:instrText>
             </w:r>
             <w:r>
               <w:rPr>
@@ -623,7 +623,7 @@
               <w14:ligatures w14:val="standardContextual"/>
             </w:rPr>
           </w:pPr>
-          <w:hyperlink w:anchor="_Toc244090135" w:history="1">
+          <w:hyperlink w:anchor="_Toc244093636" w:history="1">
             <w:r>
               <w:rPr>
                 <w:rStyle w:val="Hypertextovodkaz"/>
@@ -647,7 +647,7 @@
               <w:rPr>
                 <w:noProof/>
               </w:rPr>
-              <w:instrText xml:space="preserve"> PAGEREF _Toc244090135 \h </w:instrText>
+              <w:instrText xml:space="preserve"> PAGEREF _Toc244093636 \h </w:instrText>
             </w:r>
             <w:r>
               <w:rPr>
@@ -690,7 +690,7 @@
               <w14:ligatures w14:val="standardContextual"/>
             </w:rPr>
           </w:pPr>
-          <w:hyperlink w:anchor="_Toc244090136" w:history="1">
+          <w:hyperlink w:anchor="_Toc244093637" w:history="1">
             <w:r>
               <w:rPr>
                 <w:rStyle w:val="Hypertextovodkaz"/>
@@ -714,7 +714,7 @@
               <w:rPr>
                 <w:noProof/>
               </w:rPr>
-              <w:instrText xml:space="preserve"> PAGEREF _Toc244090136 \h </w:instrText>
+              <w:instrText xml:space="preserve"> PAGEREF _Toc244093637 \h </w:instrText>
             </w:r>
             <w:r>
               <w:rPr>
@@ -757,7 +757,7 @@
               <w14:ligatures w14:val="standardContextual"/>
             </w:rPr>
           </w:pPr>
-          <w:hyperlink w:anchor="_Toc244090137" w:history="1">
+          <w:hyperlink w:anchor="_Toc244093638" w:history="1">
             <w:r>
               <w:rPr>
                 <w:rStyle w:val="Hypertextovodkaz"/>
@@ -781,7 +781,7 @@
               <w:rPr>
                 <w:noProof/>
               </w:rPr>
-              <w:instrText xml:space="preserve"> PAGEREF _Toc244090137 \h </w:instrText>
+              <w:instrText xml:space="preserve"> PAGEREF _Toc244093638 \h </w:instrText>
             </w:r>
             <w:r>
               <w:rPr>
@@ -824,7 +824,7 @@
               <w14:ligatures w14:val="standardContextual"/>
             </w:rPr>
           </w:pPr>
-          <w:hyperlink w:anchor="_Toc244090138" w:history="1">
+          <w:hyperlink w:anchor="_Toc244093639" w:history="1">
             <w:r>
               <w:rPr>
                 <w:rStyle w:val="Hypertextovodkaz"/>
@@ -848,7 +848,7 @@
               <w:rPr>
                 <w:noProof/>
               </w:rPr>
-              <w:instrText xml:space="preserve"> PAGEREF _Toc244090138 \h </w:instrText>
+              <w:instrText xml:space="preserve"> PAGEREF _Toc244093639 \h </w:instrText>
             </w:r>
             <w:r>
               <w:rPr>
@@ -891,7 +891,7 @@
               <w14:ligatures w14:val="standardContextual"/>
             </w:rPr>
           </w:pPr>
-          <w:hyperlink w:anchor="_Toc244090139" w:history="1">
+          <w:hyperlink w:anchor="_Toc244093640" w:history="1">
             <w:r>
               <w:rPr>
                 <w:rStyle w:val="Hypertextovodkaz"/>
@@ -915,7 +915,7 @@
               <w:rPr>
                 <w:noProof/>
               </w:rPr>
-              <w:instrText xml:space="preserve"> PAGEREF _Toc244090139 \h </w:instrText>
+              <w:instrText xml:space="preserve"> PAGEREF _Toc244093640 \h </w:instrText>
             </w:r>
             <w:r>
               <w:rPr>
@@ -958,7 +958,7 @@
               <w14:ligatures w14:val="standardContextual"/>
             </w:rPr>
           </w:pPr>
-          <w:hyperlink w:anchor="_Toc244090140" w:history="1">
+          <w:hyperlink w:anchor="_Toc244093641" w:history="1">
             <w:r>
               <w:rPr>
                 <w:rStyle w:val="Hypertextovodkaz"/>
@@ -982,7 +982,7 @@
               <w:rPr>
                 <w:noProof/>
               </w:rPr>
-              <w:instrText xml:space="preserve"> PAGEREF _Toc244090140 \h </w:instrText>
+              <w:instrText xml:space="preserve"> PAGEREF _Toc244093641 \h </w:instrText>
             </w:r>
             <w:r>
               <w:rPr>
@@ -1025,7 +1025,7 @@
               <w14:ligatures w14:val="standardContextual"/>
             </w:rPr>
           </w:pPr>
-          <w:hyperlink w:anchor="_Toc244090141" w:history="1">
+          <w:hyperlink w:anchor="_Toc244093642" w:history="1">
             <w:r>
               <w:rPr>
                 <w:rStyle w:val="Hypertextovodkaz"/>
@@ -1049,7 +1049,7 @@
               <w:rPr>
                 <w:noProof/>
               </w:rPr>
-              <w:instrText xml:space="preserve"> PAGEREF _Toc244090141 \h </w:instrText>
+              <w:instrText xml:space="preserve"> PAGEREF _Toc244093642 \h </w:instrText>
             </w:r>
             <w:r>
               <w:rPr>
@@ -1092,7 +1092,7 @@
               <w14:ligatures w14:val="standardContextual"/>
             </w:rPr>
           </w:pPr>
-          <w:hyperlink w:anchor="_Toc244090142" w:history="1">
+          <w:hyperlink w:anchor="_Toc244093643" w:history="1">
             <w:r>
               <w:rPr>
                 <w:rStyle w:val="Hypertextovodkaz"/>
@@ -1116,7 +1116,7 @@
               <w:rPr>
                 <w:noProof/>
               </w:rPr>
-              <w:instrText xml:space="preserve"> PAGEREF _Toc244090142 \h </w:instrText>
+              <w:instrText xml:space="preserve"> PAGEREF _Toc244093643 \h </w:instrText>
             </w:r>
             <w:r>
               <w:rPr>
@@ -1159,7 +1159,7 @@
               <w14:ligatures w14:val="standardContextual"/>
             </w:rPr>
           </w:pPr>
-          <w:hyperlink w:anchor="_Toc244090143" w:history="1">
+          <w:hyperlink w:anchor="_Toc244093644" w:history="1">
             <w:r>
               <w:rPr>
                 <w:rStyle w:val="Hypertextovodkaz"/>
@@ -1183,7 +1183,7 @@
               <w:rPr>
                 <w:noProof/>
               </w:rPr>
-              <w:instrText xml:space="preserve"> PAGEREF _Toc244090143 \h </w:instrText>
+              <w:instrText xml:space="preserve"> PAGEREF _Toc244093644 \h </w:instrText>
             </w:r>
             <w:r>
               <w:rPr>
@@ -1226,7 +1226,7 @@
               <w14:ligatures w14:val="standardContextual"/>
             </w:rPr>
           </w:pPr>
-          <w:hyperlink w:anchor="_Toc244090144" w:history="1">
+          <w:hyperlink w:anchor="_Toc244093645" w:history="1">
             <w:r>
               <w:rPr>
                 <w:rStyle w:val="Hypertextovodkaz"/>
@@ -1250,7 +1250,7 @@
               <w:rPr>
                 <w:noProof/>
               </w:rPr>
-              <w:instrText xml:space="preserve"> PAGEREF _Toc244090144 \h </w:instrText>
+              <w:instrText xml:space="preserve"> PAGEREF _Toc244093645 \h </w:instrText>
             </w:r>
             <w:r>
               <w:rPr>
@@ -1293,7 +1293,7 @@
               <w14:ligatures w14:val="standardContextual"/>
             </w:rPr>
           </w:pPr>
-          <w:hyperlink w:anchor="_Toc244090145" w:history="1">
+          <w:hyperlink w:anchor="_Toc244093646" w:history="1">
             <w:r>
               <w:rPr>
                 <w:rStyle w:val="Hypertextovodkaz"/>
@@ -1317,7 +1317,7 @@
               <w:rPr>
                 <w:noProof/>
               </w:rPr>
-              <w:instrText xml:space="preserve"> PAGEREF _Toc244090145 \h </w:instrText>
+              <w:instrText xml:space="preserve"> PAGEREF _Toc244093646 \h </w:instrText>
             </w:r>
             <w:r>
               <w:rPr>
@@ -1360,7 +1360,7 @@
               <w14:ligatures w14:val="standardContextual"/>
             </w:rPr>
           </w:pPr>
-          <w:hyperlink w:anchor="_Toc244090146" w:history="1">
+          <w:hyperlink w:anchor="_Toc244093647" w:history="1">
             <w:r>
               <w:rPr>
                 <w:rStyle w:val="Hypertextovodkaz"/>
@@ -1384,7 +1384,7 @@
               <w:rPr>
                 <w:noProof/>
               </w:rPr>
-              <w:instrText xml:space="preserve"> PAGEREF _Toc244090146 \h </w:instrText>
+              <w:instrText xml:space="preserve"> PAGEREF _Toc244093647 \h </w:instrText>
             </w:r>
             <w:r>
               <w:rPr>
@@ -1427,7 +1427,7 @@
               <w14:ligatures w14:val="standardContextual"/>
             </w:rPr>
           </w:pPr>
-          <w:hyperlink w:anchor="_Toc244090147" w:history="1">
+          <w:hyperlink w:anchor="_Toc244093648" w:history="1">
             <w:r>
               <w:rPr>
                 <w:rStyle w:val="Hypertextovodkaz"/>
@@ -1451,7 +1451,7 @@
               <w:rPr>
                 <w:noProof/>
               </w:rPr>
-              <w:instrText xml:space="preserve"> PAGEREF _Toc244090147 \h </w:instrText>
+              <w:instrText xml:space="preserve"> PAGEREF _Toc244093648 \h </w:instrText>
             </w:r>
             <w:r>
               <w:rPr>
@@ -1494,7 +1494,7 @@
               <w14:ligatures w14:val="standardContextual"/>
             </w:rPr>
           </w:pPr>
-          <w:hyperlink w:anchor="_Toc244090148" w:history="1">
+          <w:hyperlink w:anchor="_Toc244093649" w:history="1">
             <w:r>
               <w:rPr>
                 <w:rStyle w:val="Hypertextovodkaz"/>
@@ -1518,7 +1518,7 @@
               <w:rPr>
                 <w:noProof/>
               </w:rPr>
-              <w:instrText xml:space="preserve"> PAGEREF _Toc244090148 \h </w:instrText>
+              <w:instrText xml:space="preserve"> PAGEREF _Toc244093649 \h </w:instrText>
             </w:r>
             <w:r>
               <w:rPr>
@@ -1561,7 +1561,7 @@
               <w14:ligatures w14:val="standardContextual"/>
             </w:rPr>
           </w:pPr>
-          <w:hyperlink w:anchor="_Toc244090149" w:history="1">
+          <w:hyperlink w:anchor="_Toc244093650" w:history="1">
             <w:r>
               <w:rPr>
                 <w:rStyle w:val="Hypertextovodkaz"/>
@@ -1585,7 +1585,7 @@
               <w:rPr>
                 <w:noProof/>
               </w:rPr>
-              <w:instrText xml:space="preserve"> PAGEREF _Toc244090149 \h </w:instrText>
+              <w:instrText xml:space="preserve"> PAGEREF _Toc244093650 \h </w:instrText>
             </w:r>
             <w:r>
               <w:rPr>
@@ -1628,7 +1628,7 @@
               <w14:ligatures w14:val="standardContextual"/>
             </w:rPr>
           </w:pPr>
-          <w:hyperlink w:anchor="_Toc244090150" w:history="1">
+          <w:hyperlink w:anchor="_Toc244093651" w:history="1">
             <w:r>
               <w:rPr>
                 <w:rStyle w:val="Hypertextovodkaz"/>
@@ -1652,7 +1652,7 @@
               <w:rPr>
                 <w:noProof/>
               </w:rPr>
-              <w:instrText xml:space="preserve"> PAGEREF _Toc244090150 \h </w:instrText>
+              <w:instrText xml:space="preserve"> PAGEREF _Toc244093651 \h </w:instrText>
             </w:r>
             <w:r>
               <w:rPr>
@@ -1695,7 +1695,7 @@
               <w14:ligatures w14:val="standardContextual"/>
             </w:rPr>
           </w:pPr>
-          <w:hyperlink w:anchor="_Toc244090151" w:history="1">
+          <w:hyperlink w:anchor="_Toc244093652" w:history="1">
             <w:r>
               <w:rPr>
                 <w:rStyle w:val="Hypertextovodkaz"/>
@@ -1719,7 +1719,7 @@
               <w:rPr>
                 <w:noProof/>
               </w:rPr>
-              <w:instrText xml:space="preserve"> PAGEREF _Toc244090151 \h </w:instrText>
+              <w:instrText xml:space="preserve"> PAGEREF _Toc244093652 \h </w:instrText>
             </w:r>
             <w:r>
               <w:rPr>
@@ -1762,7 +1762,7 @@
               <w14:ligatures w14:val="standardContextual"/>
             </w:rPr>
           </w:pPr>
-          <w:hyperlink w:anchor="_Toc244090152" w:history="1">
+          <w:hyperlink w:anchor="_Toc244093653" w:history="1">
             <w:r>
               <w:rPr>
                 <w:rStyle w:val="Hypertextovodkaz"/>
@@ -1786,7 +1786,7 @@
               <w:rPr>
                 <w:noProof/>
               </w:rPr>
-              <w:instrText xml:space="preserve"> PAGEREF _Toc244090152 \h </w:instrText>
+              <w:instrText xml:space="preserve"> PAGEREF _Toc244093653 \h </w:instrText>
             </w:r>
             <w:r>
               <w:rPr>
@@ -1829,7 +1829,7 @@
               <w14:ligatures w14:val="standardContextual"/>
             </w:rPr>
           </w:pPr>
-          <w:hyperlink w:anchor="_Toc244090153" w:history="1">
+          <w:hyperlink w:anchor="_Toc244093654" w:history="1">
             <w:r>
               <w:rPr>
                 <w:rStyle w:val="Hypertextovodkaz"/>
@@ -1853,7 +1853,7 @@
               <w:rPr>
                 <w:noProof/>
               </w:rPr>
-              <w:instrText xml:space="preserve"> PAGEREF _Toc244090153 \h </w:instrText>
+              <w:instrText xml:space="preserve"> PAGEREF _Toc244093654 \h </w:instrText>
             </w:r>
             <w:r>
               <w:rPr>
@@ -1896,7 +1896,7 @@
               <w14:ligatures w14:val="standardContextual"/>
             </w:rPr>
           </w:pPr>
-          <w:hyperlink w:anchor="_Toc244090154" w:history="1">
+          <w:hyperlink w:anchor="_Toc244093655" w:history="1">
             <w:r>
               <w:rPr>
                 <w:rStyle w:val="Hypertextovodkaz"/>
@@ -1920,7 +1920,7 @@
               <w:rPr>
                 <w:noProof/>
               </w:rPr>
-              <w:instrText xml:space="preserve"> PAGEREF _Toc244090154 \h </w:instrText>
+              <w:instrText xml:space="preserve"> PAGEREF _Toc244093655 \h </w:instrText>
             </w:r>
             <w:r>
               <w:rPr>
@@ -1968,7 +1968,7 @@
       <w:pPr>
         <w:pStyle w:val="Nadpis1"/>
       </w:pPr>
-      <w:bookmarkStart w:id="0" w:name="_Toc244090132"/>
+      <w:bookmarkStart w:id="0" w:name="_Toc244093633"/>
       <w:r>
         <w:t>1  About this document</w:t>
       </w:r>
@@ -2442,7 +2442,7 @@
         <w:pStyle w:val="Nadpis1"/>
         <w:spacing w:before="480"/>
       </w:pPr>
-      <w:bookmarkStart w:id="1" w:name="_Toc244090133"/>
+      <w:bookmarkStart w:id="1" w:name="_Toc244093634"/>
       <w:r>
         <w:t>2  Operating principle</w:t>
       </w:r>
@@ -2493,7 +2493,7 @@
       <w:pPr>
         <w:pStyle w:val="Nadpis2"/>
       </w:pPr>
-      <w:bookmarkStart w:id="2" w:name="_Toc244090134"/>
+      <w:bookmarkStart w:id="2" w:name="_Toc244093635"/>
       <w:r>
         <w:t>2.1  Components</w:t>
       </w:r>
@@ -3084,7 +3084,7 @@
       <w:pPr>
         <w:pStyle w:val="Nadpis2"/>
       </w:pPr>
-      <w:bookmarkStart w:id="3" w:name="_Toc244090135"/>
+      <w:bookmarkStart w:id="3" w:name="_Toc244093636"/>
       <w:r>
         <w:t>2.2  Data sources</w:t>
       </w:r>
@@ -3724,14 +3724,14 @@
         <w:t>done_remote</w:t>
       </w:r>
       <w:r>
-        <w:t xml:space="preserve"> = Synced. The file format is described in the DatabaseGateway Instructions for Use.</w:t>
+        <w:t xml:space="preserve"> = Synced. The file format is described in the DatabaseGateway Technical Description.</w:t>
       </w:r>
     </w:p>
     <w:p>
       <w:pPr>
         <w:pStyle w:val="Nadpis2"/>
       </w:pPr>
-      <w:bookmarkStart w:id="4" w:name="_Toc244090136"/>
+      <w:bookmarkStart w:id="4" w:name="_Toc244093637"/>
       <w:r>
         <w:t>2.3  Faults and outages</w:t>
       </w:r>
@@ -4232,7 +4232,7 @@
         <w:pStyle w:val="Nadpis1"/>
         <w:spacing w:before="480"/>
       </w:pPr>
-      <w:bookmarkStart w:id="5" w:name="_Toc244090137"/>
+      <w:bookmarkStart w:id="5" w:name="_Toc244093638"/>
       <w:r>
         <w:t>3  PLC interface</w:t>
       </w:r>
@@ -5312,7 +5312,7 @@
         <w:pStyle w:val="Nadpis1"/>
         <w:spacing w:before="480"/>
       </w:pPr>
-      <w:bookmarkStart w:id="6" w:name="_Toc244090138"/>
+      <w:bookmarkStart w:id="6" w:name="_Toc244093639"/>
       <w:r>
         <w:t>4  Users and access</w:t>
       </w:r>
@@ -5322,7 +5322,7 @@
       <w:pPr>
         <w:pStyle w:val="Nadpis2"/>
       </w:pPr>
-      <w:bookmarkStart w:id="7" w:name="_Toc244090139"/>
+      <w:bookmarkStart w:id="7" w:name="_Toc244093640"/>
       <w:r>
         <w:t>4.1  Roles</w:t>
       </w:r>
@@ -5935,7 +5935,7 @@
       <w:pPr>
         <w:pStyle w:val="Nadpis2"/>
       </w:pPr>
-      <w:bookmarkStart w:id="8" w:name="_Toc244090140"/>
+      <w:bookmarkStart w:id="8" w:name="_Toc244093641"/>
       <w:r>
         <w:t>4.2  At the tester and remotely</w:t>
       </w:r>
@@ -6072,7 +6072,7 @@
       <w:pPr>
         <w:pStyle w:val="Nadpis2"/>
       </w:pPr>
-      <w:bookmarkStart w:id="9" w:name="_Toc244090141"/>
+      <w:bookmarkStart w:id="9" w:name="_Toc244093642"/>
       <w:r>
         <w:t>4.3  Sign-in and sessions</w:t>
       </w:r>
@@ -6211,7 +6211,7 @@
         <w:pStyle w:val="Nadpis1"/>
         <w:spacing w:before="480"/>
       </w:pPr>
-      <w:bookmarkStart w:id="10" w:name="_Toc244090142"/>
+      <w:bookmarkStart w:id="10" w:name="_Toc244093643"/>
       <w:r>
         <w:t>5  REST API and WebSocket</w:t>
       </w:r>
@@ -7491,7 +7491,7 @@
         <w:pStyle w:val="Nadpis1"/>
         <w:spacing w:before="480"/>
       </w:pPr>
-      <w:bookmarkStart w:id="11" w:name="_Toc244090143"/>
+      <w:bookmarkStart w:id="11" w:name="_Toc244093644"/>
       <w:r>
         <w:t>6  Configuration (Config.toml)</w:t>
       </w:r>
@@ -8955,7 +8955,7 @@
         <w:pStyle w:val="Nadpis1"/>
         <w:spacing w:before="480"/>
       </w:pPr>
-      <w:bookmarkStart w:id="12" w:name="_Toc244090144"/>
+      <w:bookmarkStart w:id="12" w:name="_Toc244093645"/>
       <w:r>
         <w:t>7  Installation and update</w:t>
       </w:r>
@@ -8965,7 +8965,7 @@
       <w:pPr>
         <w:pStyle w:val="Nadpis2"/>
       </w:pPr>
-      <w:bookmarkStart w:id="13" w:name="_Toc244090145"/>
+      <w:bookmarkStart w:id="13" w:name="_Toc244093646"/>
       <w:r>
         <w:t>7.1  Package contents</w:t>
       </w:r>
@@ -9570,7 +9570,7 @@
       <w:pPr>
         <w:pStyle w:val="Nadpis2"/>
       </w:pPr>
-      <w:bookmarkStart w:id="14" w:name="_Toc244090146"/>
+      <w:bookmarkStart w:id="14" w:name="_Toc244093647"/>
       <w:r>
         <w:t>7.2  First installation</w:t>
       </w:r>
@@ -9796,7 +9796,7 @@
       <w:pPr>
         <w:pStyle w:val="Nadpis2"/>
       </w:pPr>
-      <w:bookmarkStart w:id="15" w:name="_Toc244090147"/>
+      <w:bookmarkStart w:id="15" w:name="_Toc244093648"/>
       <w:r>
         <w:t>7.3  Update on the tester PC</w:t>
       </w:r>
@@ -9902,7 +9902,7 @@
       <w:pPr>
         <w:pStyle w:val="Nadpis2"/>
       </w:pPr>
-      <w:bookmarkStart w:id="16" w:name="_Toc244090148"/>
+      <w:bookmarkStart w:id="16" w:name="_Toc244093649"/>
       <w:r>
         <w:t>7.4  Stopping and uninstallation</w:t>
       </w:r>
@@ -9943,7 +9943,7 @@
         <w:pStyle w:val="Nadpis1"/>
         <w:spacing w:before="480"/>
       </w:pPr>
-      <w:bookmarkStart w:id="17" w:name="_Toc244090149"/>
+      <w:bookmarkStart w:id="17" w:name="_Toc244093650"/>
       <w:r>
         <w:t>8  Operation and diagnostics</w:t>
       </w:r>
@@ -9953,7 +9953,7 @@
       <w:pPr>
         <w:pStyle w:val="Nadpis2"/>
       </w:pPr>
-      <w:bookmarkStart w:id="18" w:name="_Toc244090150"/>
+      <w:bookmarkStart w:id="18" w:name="_Toc244093651"/>
       <w:r>
         <w:t>8.1  How to check the state</w:t>
       </w:r>
@@ -10498,7 +10498,7 @@
       <w:pPr>
         <w:pStyle w:val="Nadpis2"/>
       </w:pPr>
-      <w:bookmarkStart w:id="19" w:name="_Toc244090151"/>
+      <w:bookmarkStart w:id="19" w:name="_Toc244093652"/>
       <w:r>
         <w:t>8.2  Logs</w:t>
       </w:r>
@@ -10708,7 +10708,7 @@
       <w:pPr>
         <w:pStyle w:val="Nadpis2"/>
       </w:pPr>
-      <w:bookmarkStart w:id="20" w:name="_Toc244090152"/>
+      <w:bookmarkStart w:id="20" w:name="_Toc244093653"/>
       <w:r>
         <w:t>8.3  Cache and memory</w:t>
       </w:r>
@@ -10788,7 +10788,7 @@
         <w:pStyle w:val="Nadpis1"/>
         <w:spacing w:before="480"/>
       </w:pPr>
-      <w:bookmarkStart w:id="21" w:name="_Toc244090153"/>
+      <w:bookmarkStart w:id="21" w:name="_Toc244093654"/>
       <w:r>
         <w:t>9  Troubleshooting</w:t>
       </w:r>
@@ -12112,7 +12112,7 @@
         <w:pStyle w:val="Nadpis1"/>
         <w:spacing w:before="480"/>
       </w:pPr>
-      <w:bookmarkStart w:id="22" w:name="_Toc244090154"/>
+      <w:bookmarkStart w:id="22" w:name="_Toc244093655"/>
       <w:r>
         <w:t>Appendix A  Terms and abbreviations</w:t>
       </w:r>
@@ -12941,10 +12941,64 @@
 <file path=word/numbering.xml><?xml version="1.0" encoding="utf-8"?>
 <w:numbering xmlns:wpc="http://schemas.microsoft.com/office/word/2010/wordprocessingCanvas" xmlns:cx="http://schemas.microsoft.com/office/drawing/2014/chartex" xmlns:cx1="http://schemas.microsoft.com/office/drawing/2015/9/8/chartex" xmlns:cx2="http://schemas.microsoft.com/office/drawing/2015/10/21/chartex" xmlns:cx3="http://schemas.microsoft.com/office/drawing/2016/5/9/chartex" xmlns:cx4="http://schemas.microsoft.com/office/drawing/2016/5/10/chartex" xmlns:cx5="http://schemas.microsoft.com/office/drawing/2016/5/11/chartex" xmlns:cx6="http://schemas.microsoft.com/office/drawing/2016/5/12/chartex" xmlns:cx7="http://schemas.microsoft.com/office/drawing/2016/5/13/chartex" xmlns:cx8="http://schemas.microsoft.com/office/drawing/2016/5/14/chartex" xmlns:mc="http://schemas.openxmlformats.org/markup-compatibility/2006" xmlns:aink="http://schemas.microsoft.com/office/drawing/2016/ink" xmlns:am3d="http://schemas.microsoft.com/office/drawing/2017/model3d" xmlns:o="urn:schemas-microsoft-com:office:office" xmlns:oel="http://schemas.microsoft.com/office/2019/extlst" xmlns:r="http://schemas.openxmlformats.org/officeDocument/2006/relationships" xmlns:m="http://schemas.openxmlformats.org/officeDocument/2006/math" xmlns:v="urn:schemas-microsoft-com:vml" xmlns:wp14="http://schemas.microsoft.com/office/word/2010/wordprocessingDrawing" xmlns:wp="http://schemas.openxmlformats.org/drawingml/2006/wordprocessingDrawing" xmlns:w10="urn:schemas-microsoft-com:office:word" xmlns:w="http://schemas.openxmlformats.org/wordprocessingml/2006/main" xmlns:w14="http://schemas.microsoft.com/office/word/2010/wordml" xmlns:w15="http://schemas.microsoft.com/office/word/2012/wordml" xmlns:w16cex="http://schemas.microsoft.com/office/word/2018/wordml/cex" xmlns:w16cid="http://schemas.microsoft.com/office/word/2016/wordml/cid" xmlns:w16="http://schemas.microsoft.com/office/word/2018/wordml" xmlns:w16du="http://schemas.microsoft.com/office/word/2023/wordml/word16du" xmlns:w16sdtdh="http://schemas.microsoft.com/office/word/2020/wordml/sdtdatahash" xmlns:w16sdtfl="http://schemas.microsoft.com/office/word/2024/wordml/sdtformatlock" xmlns:w16se="http://schemas.microsoft.com/office/word/2015/wordml/symex" xmlns:wpg="http://schemas.microsoft.com/office/word/2010/wordprocessingGroup" xmlns:wpi="http://schemas.microsoft.com/office/word/2010/wordprocessingInk" xmlns:wne="http://schemas.microsoft.com/office/word/2006/wordml" xmlns:wps="http://schemas.microsoft.com/office/word/2010/wordprocessingShape" mc:Ignorable="w14 w15 w16se w16cid w16 w16cex w16sdtdh w16sdtfl w16du wp14">
   <w:abstractNum w:abstractNumId="0" w15:restartNumberingAfterBreak="0">
-    <w:nsid w:val="4E9321F1"/>
+    <w:nsid w:val="040851CC"/>
     <w:multiLevelType w:val="hybridMultilevel"/>
-    <w:tmpl w:val="B1685172"/>
-    <w:lvl w:ilvl="0" w:tplc="EC064B34">
+    <w:tmpl w:val="99FAB80E"/>
+    <w:lvl w:ilvl="0" w:tplc="9E6C1A62">
+      <w:start w:val="1"/>
+      <w:numFmt w:val="bullet"/>
+      <w:lvlText w:val="•"/>
+      <w:lvlJc w:val="left"/>
+      <w:pPr>
+        <w:ind w:left="540" w:hanging="270"/>
+      </w:pPr>
+    </w:lvl>
+    <w:lvl w:ilvl="1" w:tplc="8CF2C2E8">
+      <w:numFmt w:val="decimal"/>
+      <w:lvlText w:val=""/>
+      <w:lvlJc w:val="left"/>
+    </w:lvl>
+    <w:lvl w:ilvl="2" w:tplc="D4AC458E">
+      <w:numFmt w:val="decimal"/>
+      <w:lvlText w:val=""/>
+      <w:lvlJc w:val="left"/>
+    </w:lvl>
+    <w:lvl w:ilvl="3" w:tplc="C2026FA4">
+      <w:numFmt w:val="decimal"/>
+      <w:lvlText w:val=""/>
+      <w:lvlJc w:val="left"/>
+    </w:lvl>
+    <w:lvl w:ilvl="4" w:tplc="7A06C754">
+      <w:numFmt w:val="decimal"/>
+      <w:lvlText w:val=""/>
+      <w:lvlJc w:val="left"/>
+    </w:lvl>
+    <w:lvl w:ilvl="5" w:tplc="845E850C">
+      <w:numFmt w:val="decimal"/>
+      <w:lvlText w:val=""/>
+      <w:lvlJc w:val="left"/>
+    </w:lvl>
+    <w:lvl w:ilvl="6" w:tplc="9D22B4B8">
+      <w:numFmt w:val="decimal"/>
+      <w:lvlText w:val=""/>
+      <w:lvlJc w:val="left"/>
+    </w:lvl>
+    <w:lvl w:ilvl="7" w:tplc="705E5F22">
+      <w:numFmt w:val="decimal"/>
+      <w:lvlText w:val=""/>
+      <w:lvlJc w:val="left"/>
+    </w:lvl>
+    <w:lvl w:ilvl="8" w:tplc="351828A6">
+      <w:numFmt w:val="decimal"/>
+      <w:lvlText w:val=""/>
+      <w:lvlJc w:val="left"/>
+    </w:lvl>
+  </w:abstractNum>
+  <w:abstractNum w:abstractNumId="1" w15:restartNumberingAfterBreak="0">
+    <w:nsid w:val="0BA97A24"/>
+    <w:multiLevelType w:val="hybridMultilevel"/>
+    <w:tmpl w:val="329877F4"/>
+    <w:lvl w:ilvl="0" w:tplc="593EF410">
       <w:start w:val="1"/>
       <w:numFmt w:val="decimal"/>
       <w:lvlText w:val="%1."/>
@@ -12953,106 +13007,52 @@
         <w:ind w:left="540" w:hanging="300"/>
       </w:pPr>
     </w:lvl>
-    <w:lvl w:ilvl="1" w:tplc="5FDE247E">
+    <w:lvl w:ilvl="1" w:tplc="98903394">
       <w:numFmt w:val="decimal"/>
       <w:lvlText w:val=""/>
       <w:lvlJc w:val="left"/>
     </w:lvl>
-    <w:lvl w:ilvl="2" w:tplc="39B68E7C">
+    <w:lvl w:ilvl="2" w:tplc="2572EB0A">
       <w:numFmt w:val="decimal"/>
       <w:lvlText w:val=""/>
       <w:lvlJc w:val="left"/>
     </w:lvl>
-    <w:lvl w:ilvl="3" w:tplc="AFF0FC60">
+    <w:lvl w:ilvl="3" w:tplc="957C457A">
       <w:numFmt w:val="decimal"/>
       <w:lvlText w:val=""/>
       <w:lvlJc w:val="left"/>
     </w:lvl>
-    <w:lvl w:ilvl="4" w:tplc="9F98017E">
+    <w:lvl w:ilvl="4" w:tplc="BB9259B2">
       <w:numFmt w:val="decimal"/>
       <w:lvlText w:val=""/>
       <w:lvlJc w:val="left"/>
     </w:lvl>
-    <w:lvl w:ilvl="5" w:tplc="939AF784">
+    <w:lvl w:ilvl="5" w:tplc="985211B6">
       <w:numFmt w:val="decimal"/>
       <w:lvlText w:val=""/>
       <w:lvlJc w:val="left"/>
     </w:lvl>
-    <w:lvl w:ilvl="6" w:tplc="30F6A87C">
+    <w:lvl w:ilvl="6" w:tplc="ED94E11E">
       <w:numFmt w:val="decimal"/>
       <w:lvlText w:val=""/>
       <w:lvlJc w:val="left"/>
     </w:lvl>
-    <w:lvl w:ilvl="7" w:tplc="092E9042">
+    <w:lvl w:ilvl="7" w:tplc="E6E0DCA6">
       <w:numFmt w:val="decimal"/>
       <w:lvlText w:val=""/>
       <w:lvlJc w:val="left"/>
     </w:lvl>
-    <w:lvl w:ilvl="8" w:tplc="C366C5E4">
-      <w:numFmt w:val="decimal"/>
-      <w:lvlText w:val=""/>
-      <w:lvlJc w:val="left"/>
-    </w:lvl>
-  </w:abstractNum>
-  <w:abstractNum w:abstractNumId="1" w15:restartNumberingAfterBreak="0">
-    <w:nsid w:val="534B24CD"/>
-    <w:multiLevelType w:val="hybridMultilevel"/>
-    <w:tmpl w:val="1406928A"/>
-    <w:lvl w:ilvl="0" w:tplc="219A80EC">
-      <w:start w:val="1"/>
-      <w:numFmt w:val="bullet"/>
-      <w:lvlText w:val="•"/>
-      <w:lvlJc w:val="left"/>
-      <w:pPr>
-        <w:ind w:left="540" w:hanging="270"/>
-      </w:pPr>
-    </w:lvl>
-    <w:lvl w:ilvl="1" w:tplc="4510E328">
-      <w:numFmt w:val="decimal"/>
-      <w:lvlText w:val=""/>
-      <w:lvlJc w:val="left"/>
-    </w:lvl>
-    <w:lvl w:ilvl="2" w:tplc="16BC9966">
-      <w:numFmt w:val="decimal"/>
-      <w:lvlText w:val=""/>
-      <w:lvlJc w:val="left"/>
-    </w:lvl>
-    <w:lvl w:ilvl="3" w:tplc="5A0CFBB4">
-      <w:numFmt w:val="decimal"/>
-      <w:lvlText w:val=""/>
-      <w:lvlJc w:val="left"/>
-    </w:lvl>
-    <w:lvl w:ilvl="4" w:tplc="DB9EBB20">
-      <w:numFmt w:val="decimal"/>
-      <w:lvlText w:val=""/>
-      <w:lvlJc w:val="left"/>
-    </w:lvl>
-    <w:lvl w:ilvl="5" w:tplc="68AE62CC">
-      <w:numFmt w:val="decimal"/>
-      <w:lvlText w:val=""/>
-      <w:lvlJc w:val="left"/>
-    </w:lvl>
-    <w:lvl w:ilvl="6" w:tplc="C9986498">
-      <w:numFmt w:val="decimal"/>
-      <w:lvlText w:val=""/>
-      <w:lvlJc w:val="left"/>
-    </w:lvl>
-    <w:lvl w:ilvl="7" w:tplc="7BFABA84">
-      <w:numFmt w:val="decimal"/>
-      <w:lvlText w:val=""/>
-      <w:lvlJc w:val="left"/>
-    </w:lvl>
-    <w:lvl w:ilvl="8" w:tplc="0700D144">
+    <w:lvl w:ilvl="8" w:tplc="49F0DF02">
       <w:numFmt w:val="decimal"/>
       <w:lvlText w:val=""/>
       <w:lvlJc w:val="left"/>
     </w:lvl>
   </w:abstractNum>
   <w:abstractNum w:abstractNumId="2" w15:restartNumberingAfterBreak="0">
-    <w:nsid w:val="6017286B"/>
+    <w:nsid w:val="66CE4291"/>
     <w:multiLevelType w:val="hybridMultilevel"/>
-    <w:tmpl w:val="C7E6558A"/>
-    <w:lvl w:ilvl="0" w:tplc="E6FAC0D2" w:tentative="1">
+    <w:tmpl w:val="FC76CCE8"/>
+    <w:lvl w:ilvl="0" w:tplc="9B463164" w:tentative="1">
       <w:start w:val="1"/>
       <w:numFmt w:val="bullet"/>
       <w:lvlText w:val="●"/>
@@ -13061,7 +13061,7 @@
         <w:ind w:left="720" w:hanging="360"/>
       </w:pPr>
     </w:lvl>
-    <w:lvl w:ilvl="1" w:tplc="B394C8AE" w:tentative="1">
+    <w:lvl w:ilvl="1" w:tplc="1C7415F2" w:tentative="1">
       <w:start w:val="1"/>
       <w:numFmt w:val="bullet"/>
       <w:lvlText w:val="○"/>
@@ -13070,7 +13070,7 @@
         <w:ind w:left="1440" w:hanging="360"/>
       </w:pPr>
     </w:lvl>
-    <w:lvl w:ilvl="2" w:tplc="6B20404C" w:tentative="1">
+    <w:lvl w:ilvl="2" w:tplc="3DB6DE9E" w:tentative="1">
       <w:start w:val="1"/>
       <w:numFmt w:val="bullet"/>
       <w:lvlText w:val="■"/>
@@ -13079,7 +13079,7 @@
         <w:ind w:left="2160" w:hanging="360"/>
       </w:pPr>
     </w:lvl>
-    <w:lvl w:ilvl="3" w:tplc="25F6B802" w:tentative="1">
+    <w:lvl w:ilvl="3" w:tplc="0A1A06FC" w:tentative="1">
       <w:start w:val="1"/>
       <w:numFmt w:val="bullet"/>
       <w:lvlText w:val="●"/>
@@ -13088,7 +13088,7 @@
         <w:ind w:left="2880" w:hanging="360"/>
       </w:pPr>
     </w:lvl>
-    <w:lvl w:ilvl="4" w:tplc="93862A52" w:tentative="1">
+    <w:lvl w:ilvl="4" w:tplc="55D8BFCC" w:tentative="1">
       <w:start w:val="1"/>
       <w:numFmt w:val="bullet"/>
       <w:lvlText w:val="○"/>
@@ -13097,7 +13097,7 @@
         <w:ind w:left="3600" w:hanging="360"/>
       </w:pPr>
     </w:lvl>
-    <w:lvl w:ilvl="5" w:tplc="16867EA6" w:tentative="1">
+    <w:lvl w:ilvl="5" w:tplc="9EE06D1A" w:tentative="1">
       <w:start w:val="1"/>
       <w:numFmt w:val="bullet"/>
       <w:lvlText w:val="■"/>
@@ -13106,7 +13106,7 @@
         <w:ind w:left="4320" w:hanging="360"/>
       </w:pPr>
     </w:lvl>
-    <w:lvl w:ilvl="6" w:tplc="37FC3CC2" w:tentative="1">
+    <w:lvl w:ilvl="6" w:tplc="FD1A88DC" w:tentative="1">
       <w:start w:val="1"/>
       <w:numFmt w:val="bullet"/>
       <w:lvlText w:val="●"/>
@@ -13115,7 +13115,7 @@
         <w:ind w:left="5040" w:hanging="360"/>
       </w:pPr>
     </w:lvl>
-    <w:lvl w:ilvl="7" w:tplc="6AC692FC" w:tentative="1">
+    <w:lvl w:ilvl="7" w:tplc="F18878BC" w:tentative="1">
       <w:start w:val="1"/>
       <w:numFmt w:val="bullet"/>
       <w:lvlText w:val="●"/>
@@ -13124,7 +13124,7 @@
         <w:ind w:left="5760" w:hanging="360"/>
       </w:pPr>
     </w:lvl>
-    <w:lvl w:ilvl="8" w:tplc="35881C50" w:tentative="1">
+    <w:lvl w:ilvl="8" w:tplc="2B1C3BFC" w:tentative="1">
       <w:start w:val="1"/>
       <w:numFmt w:val="bullet"/>
       <w:lvlText w:val="●"/>
@@ -13134,20 +13134,20 @@
       </w:pPr>
     </w:lvl>
   </w:abstractNum>
-  <w:num w:numId="1" w16cid:durableId="1204488929">
+  <w:num w:numId="1" w16cid:durableId="995500582">
     <w:abstractNumId w:val="2"/>
     <w:lvlOverride w:ilvl="0">
       <w:startOverride w:val="1"/>
     </w:lvlOverride>
   </w:num>
-  <w:num w:numId="2" w16cid:durableId="871766744">
-    <w:abstractNumId w:val="1"/>
+  <w:num w:numId="2" w16cid:durableId="1247416742">
+    <w:abstractNumId w:val="0"/>
     <w:lvlOverride w:ilvl="0">
       <w:startOverride w:val="1"/>
     </w:lvlOverride>
   </w:num>
-  <w:num w:numId="3" w16cid:durableId="1788042567">
-    <w:abstractNumId w:val="0"/>
+  <w:num w:numId="3" w16cid:durableId="1648972395">
+    <w:abstractNumId w:val="1"/>
     <w:lvlOverride w:ilvl="0">
       <w:startOverride w:val="1"/>
     </w:lvlOverride>

</xml_diff>